<commit_message>
Refocus speech and internship report on financial management topic
Co-Authored-By: Claude Opus 5.5 <noreply@anthropic.com>
Claude-Session: https://claude.ai/code/session_01B5ATUDZVupjMwC75REBTzv
</commit_message>
<xml_diff>
--- a/internship/Internship_Report_Muhammadjon.docx
+++ b/internship/Internship_Report_Muhammadjon.docx
@@ -105,7 +105,7 @@
           <w:szCs w:val="28"/>
           <w:lang w:val="en-GB"/>
         </w:rPr>
-        <w:t>Comparative Analysis of AI-Driven and Traditional Approaches in IT Project Management: Scope, Schedule, Finance, and Resource Optimization through Intelligent Agent Systems</w:t>
+        <w:t>Comparative Research on the Effectiveness of AI-Driven Intelligent Agent Systems and Traditional Approaches in Financial Management of IT Projects</w:t>
       </w:r>
     </w:p>
     <w:p>
@@ -2132,7 +2132,7 @@
         <w:rPr>
           <w:lang w:val="en-GB"/>
         </w:rPr>
-        <w:t xml:space="preserve">apply my master's research topic in practice: compare traditional and AI-driven approaches to scope, schedule, finance and resource management.</w:t>
+        <w:t xml:space="preserve">apply my master's research topic in practice: compare the effectiveness of traditional and AI-driven approaches in the financial management of the project (cost estimation, budgeting, cost control and cost optimisation).</w:t>
       </w:r>
     </w:p>
     <w:p>
@@ -2153,7 +2153,7 @@
         <w:rPr>
           <w:lang w:val="en-GB"/>
         </w:rPr>
-        <w:t xml:space="preserve"> project planning, team coordination, task management, risk and budget tracking, MVP delivery, progress reporting and final documentation. </w:t>
+        <w:t xml:space="preserve"> project planning, budgeting and cost control, team coordination, task management, risk tracking, MVP delivery, progress reporting and final documentation. </w:t>
       </w:r>
       <w:r>
         <w:rPr>
@@ -2607,7 +2607,7 @@
               <w:rPr>
                 <w:lang w:val="en-GB"/>
               </w:rPr>
-              <w:t xml:space="preserve">Started the comparison of traditional and AI-assisted estimation for my research</w:t>
+              <w:t xml:space="preserve">Started the comparison of traditional (Excel, expert) and AI-assisted cost estimation for my research</w:t>
             </w:r>
           </w:p>
         </w:tc>
@@ -3021,7 +3021,7 @@
               <w:rPr>
                 <w:lang w:val="en-GB"/>
               </w:rPr>
-              <w:t xml:space="preserve">Updated the risk list and the budget forecast</w:t>
+              <w:t xml:space="preserve">Compared planned and actual sprint costs, and updated the risk list and the budget forecast</w:t>
             </w:r>
           </w:p>
         </w:tc>
@@ -4690,20 +4690,728 @@
         <w:rPr>
           <w:lang w:val="en-GB"/>
         </w:rPr>
-        <w:t xml:space="preserve">3.4. Traditional vs AI-driven project management</w:t>
-      </w:r>
-    </w:p>
-    <w:p>
-      <w:pPr>
-        <w:rPr>
-          <w:lang w:val="en-GB"/>
-        </w:rPr>
-      </w:pPr>
-      <w:r>
-        <w:rPr>
-          <w:lang w:val="en-GB"/>
-        </w:rPr>
-        <w:t xml:space="preserve">This part connects the internship with my research topic. The table compares the two approaches in the four areas, with examples from CallMindVoice.</w:t>
+        <w:t xml:space="preserve">3.4. Financial management of the project</w:t>
+      </w:r>
+    </w:p>
+    <w:p>
+      <w:pPr>
+        <w:rPr>
+          <w:lang w:val="en-GB"/>
+        </w:rPr>
+      </w:pPr>
+      <w:r>
+        <w:rPr>
+          <w:lang w:val="en-GB"/>
+        </w:rPr>
+        <w:t xml:space="preserve">Financial management was the main focus of my work, because it is the subject of my master's research. The budget was split into four cost groups, and at the end of every sprint the planned cost was compared with the actual cost.</w:t>
+      </w:r>
+    </w:p>
+    <w:tbl>
+      <w:tblPr>
+        <w:tblStyle w:val="TableGrid"/>
+        <w:tblW w:w="9071" w:type="dxa"/>
+        <w:tblLayout w:type="fixed"/>
+        <w:tblLook w:val="04A0" w:firstRow="1" w:lastRow="0" w:firstColumn="1" w:lastColumn="0" w:noHBand="0" w:noVBand="1"/>
+      </w:tblPr>
+      <w:tblGrid>
+        <w:gridCol w:w="1900"/>
+        <w:gridCol w:w="3571"/>
+        <w:gridCol w:w="1800"/>
+        <w:gridCol w:w="1800"/>
+      </w:tblGrid>
+      <w:tr>
+        <w:trPr>
+          <w:tblHeader/>
+        </w:trPr>
+        <w:tc>
+          <w:tcPr>
+            <w:tcW w:w="1900" w:type="dxa"/>
+            <w:shd w:val="clear" w:color="auto" w:fill="F2F2F2"/>
+          </w:tcPr>
+          <w:p>
+            <w:pPr>
+              <w:pStyle w:val="Table"/>
+              <w:rPr>
+                <w:lang w:val="en-GB"/>
+              </w:rPr>
+            </w:pPr>
+            <w:r>
+              <w:rPr>
+                <w:b/>
+                <w:bCs/>
+                <w:lang w:val="en-GB"/>
+              </w:rPr>
+              <w:t xml:space="preserve">Cost group</w:t>
+            </w:r>
+          </w:p>
+        </w:tc>
+        <w:tc>
+          <w:tcPr>
+            <w:tcW w:w="3571" w:type="dxa"/>
+            <w:shd w:val="clear" w:color="auto" w:fill="F2F2F2"/>
+          </w:tcPr>
+          <w:p>
+            <w:pPr>
+              <w:pStyle w:val="Table"/>
+              <w:rPr>
+                <w:lang w:val="en-GB"/>
+              </w:rPr>
+            </w:pPr>
+            <w:r>
+              <w:rPr>
+                <w:b/>
+                <w:bCs/>
+                <w:lang w:val="en-GB"/>
+              </w:rPr>
+              <w:t xml:space="preserve">What it includes</w:t>
+            </w:r>
+          </w:p>
+        </w:tc>
+        <w:tc>
+          <w:tcPr>
+            <w:tcW w:w="1800" w:type="dxa"/>
+            <w:shd w:val="clear" w:color="auto" w:fill="F2F2F2"/>
+          </w:tcPr>
+          <w:p>
+            <w:pPr>
+              <w:pStyle w:val="Table"/>
+              <w:rPr>
+                <w:lang w:val="en-GB"/>
+              </w:rPr>
+            </w:pPr>
+            <w:r>
+              <w:rPr>
+                <w:b/>
+                <w:bCs/>
+                <w:lang w:val="en-GB"/>
+              </w:rPr>
+              <w:t xml:space="preserve">Planned (UZS)</w:t>
+            </w:r>
+          </w:p>
+        </w:tc>
+        <w:tc>
+          <w:tcPr>
+            <w:tcW w:w="1800" w:type="dxa"/>
+            <w:shd w:val="clear" w:color="auto" w:fill="F2F2F2"/>
+          </w:tcPr>
+          <w:p>
+            <w:pPr>
+              <w:pStyle w:val="Table"/>
+              <w:rPr>
+                <w:lang w:val="en-GB"/>
+              </w:rPr>
+            </w:pPr>
+            <w:r>
+              <w:rPr>
+                <w:b/>
+                <w:bCs/>
+                <w:lang w:val="en-GB"/>
+              </w:rPr>
+              <w:t xml:space="preserve">Actual (UZS)</w:t>
+            </w:r>
+          </w:p>
+        </w:tc>
+      </w:tr>
+      <w:tr>
+        <w:tc>
+          <w:tcPr>
+            <w:tcW w:w="1900" w:type="dxa"/>
+          </w:tcPr>
+          <w:p>
+            <w:pPr>
+              <w:pStyle w:val="Table"/>
+              <w:rPr>
+                <w:lang w:val="en-GB"/>
+              </w:rPr>
+            </w:pPr>
+            <w:r>
+              <w:rPr>
+                <w:lang w:val="en-GB"/>
+              </w:rPr>
+              <w:t xml:space="preserve">Team</w:t>
+            </w:r>
+          </w:p>
+        </w:tc>
+        <w:tc>
+          <w:tcPr>
+            <w:tcW w:w="3571" w:type="dxa"/>
+          </w:tcPr>
+          <w:p>
+            <w:pPr>
+              <w:pStyle w:val="Table"/>
+              <w:rPr>
+                <w:lang w:val="en-GB"/>
+              </w:rPr>
+            </w:pPr>
+            <w:r>
+              <w:rPr>
+                <w:lang w:val="en-GB"/>
+              </w:rPr>
+              <w:t xml:space="preserve">Working hours of 7 people × hourly rate</w:t>
+            </w:r>
+          </w:p>
+        </w:tc>
+        <w:tc>
+          <w:tcPr>
+            <w:tcW w:w="1800" w:type="dxa"/>
+          </w:tcPr>
+          <w:p>
+            <w:pPr>
+              <w:pStyle w:val="Table"/>
+              <w:rPr>
+                <w:lang w:val="en-GB"/>
+              </w:rPr>
+            </w:pPr>
+            <w:r>
+              <w:rPr>
+                <w:highlight w:val="yellow"/>
+                <w:lang w:val="en-GB"/>
+              </w:rPr>
+              <w:t xml:space="preserve">to be filled</w:t>
+            </w:r>
+          </w:p>
+        </w:tc>
+        <w:tc>
+          <w:tcPr>
+            <w:tcW w:w="1800" w:type="dxa"/>
+          </w:tcPr>
+          <w:p>
+            <w:pPr>
+              <w:pStyle w:val="Table"/>
+              <w:rPr>
+                <w:lang w:val="en-GB"/>
+              </w:rPr>
+            </w:pPr>
+            <w:r>
+              <w:rPr>
+                <w:highlight w:val="yellow"/>
+                <w:lang w:val="en-GB"/>
+              </w:rPr>
+              <w:t xml:space="preserve">to be filled</w:t>
+            </w:r>
+          </w:p>
+        </w:tc>
+      </w:tr>
+      <w:tr>
+        <w:tc>
+          <w:tcPr>
+            <w:tcW w:w="1900" w:type="dxa"/>
+          </w:tcPr>
+          <w:p>
+            <w:pPr>
+              <w:pStyle w:val="Table"/>
+              <w:rPr>
+                <w:lang w:val="en-GB"/>
+              </w:rPr>
+            </w:pPr>
+            <w:r>
+              <w:rPr>
+                <w:lang w:val="en-GB"/>
+              </w:rPr>
+              <w:t xml:space="preserve">Servers</w:t>
+            </w:r>
+          </w:p>
+        </w:tc>
+        <w:tc>
+          <w:tcPr>
+            <w:tcW w:w="3571" w:type="dxa"/>
+          </w:tcPr>
+          <w:p>
+            <w:pPr>
+              <w:pStyle w:val="Table"/>
+              <w:rPr>
+                <w:lang w:val="en-GB"/>
+              </w:rPr>
+            </w:pPr>
+            <w:r>
+              <w:rPr>
+                <w:lang w:val="en-GB"/>
+              </w:rPr>
+              <w:t xml:space="preserve">Node.js server, nginx/Caddy, HTTPS, backups</w:t>
+            </w:r>
+          </w:p>
+        </w:tc>
+        <w:tc>
+          <w:tcPr>
+            <w:tcW w:w="1800" w:type="dxa"/>
+          </w:tcPr>
+          <w:p>
+            <w:pPr>
+              <w:pStyle w:val="Table"/>
+              <w:rPr>
+                <w:lang w:val="en-GB"/>
+              </w:rPr>
+            </w:pPr>
+            <w:r>
+              <w:rPr>
+                <w:highlight w:val="yellow"/>
+                <w:lang w:val="en-GB"/>
+              </w:rPr>
+              <w:t xml:space="preserve">to be filled</w:t>
+            </w:r>
+          </w:p>
+        </w:tc>
+        <w:tc>
+          <w:tcPr>
+            <w:tcW w:w="1800" w:type="dxa"/>
+          </w:tcPr>
+          <w:p>
+            <w:pPr>
+              <w:pStyle w:val="Table"/>
+              <w:rPr>
+                <w:lang w:val="en-GB"/>
+              </w:rPr>
+            </w:pPr>
+            <w:r>
+              <w:rPr>
+                <w:highlight w:val="yellow"/>
+                <w:lang w:val="en-GB"/>
+              </w:rPr>
+              <w:t xml:space="preserve">to be filled</w:t>
+            </w:r>
+          </w:p>
+        </w:tc>
+      </w:tr>
+      <w:tr>
+        <w:tc>
+          <w:tcPr>
+            <w:tcW w:w="1900" w:type="dxa"/>
+          </w:tcPr>
+          <w:p>
+            <w:pPr>
+              <w:pStyle w:val="Table"/>
+              <w:rPr>
+                <w:lang w:val="en-GB"/>
+              </w:rPr>
+            </w:pPr>
+            <w:r>
+              <w:rPr>
+                <w:lang w:val="en-GB"/>
+              </w:rPr>
+              <w:t xml:space="preserve">AI services</w:t>
+            </w:r>
+          </w:p>
+        </w:tc>
+        <w:tc>
+          <w:tcPr>
+            <w:tcW w:w="3571" w:type="dxa"/>
+          </w:tcPr>
+          <w:p>
+            <w:pPr>
+              <w:pStyle w:val="Table"/>
+              <w:rPr>
+                <w:lang w:val="en-GB"/>
+              </w:rPr>
+            </w:pPr>
+            <w:r>
+              <w:rPr>
+                <w:lang w:val="en-GB"/>
+              </w:rPr>
+              <w:t xml:space="preserve">Claude or Gemini, optional OpenAI embeddings, STT/TTS service</w:t>
+            </w:r>
+          </w:p>
+        </w:tc>
+        <w:tc>
+          <w:tcPr>
+            <w:tcW w:w="1800" w:type="dxa"/>
+          </w:tcPr>
+          <w:p>
+            <w:pPr>
+              <w:pStyle w:val="Table"/>
+              <w:rPr>
+                <w:lang w:val="en-GB"/>
+              </w:rPr>
+            </w:pPr>
+            <w:r>
+              <w:rPr>
+                <w:highlight w:val="yellow"/>
+                <w:lang w:val="en-GB"/>
+              </w:rPr>
+              <w:t xml:space="preserve">to be filled</w:t>
+            </w:r>
+          </w:p>
+        </w:tc>
+        <w:tc>
+          <w:tcPr>
+            <w:tcW w:w="1800" w:type="dxa"/>
+          </w:tcPr>
+          <w:p>
+            <w:pPr>
+              <w:pStyle w:val="Table"/>
+              <w:rPr>
+                <w:lang w:val="en-GB"/>
+              </w:rPr>
+            </w:pPr>
+            <w:r>
+              <w:rPr>
+                <w:highlight w:val="yellow"/>
+                <w:lang w:val="en-GB"/>
+              </w:rPr>
+              <w:t xml:space="preserve">to be filled</w:t>
+            </w:r>
+          </w:p>
+        </w:tc>
+      </w:tr>
+      <w:tr>
+        <w:tc>
+          <w:tcPr>
+            <w:tcW w:w="1900" w:type="dxa"/>
+          </w:tcPr>
+          <w:p>
+            <w:pPr>
+              <w:pStyle w:val="Table"/>
+              <w:rPr>
+                <w:lang w:val="en-GB"/>
+              </w:rPr>
+            </w:pPr>
+            <w:r>
+              <w:rPr>
+                <w:lang w:val="en-GB"/>
+              </w:rPr>
+              <w:t xml:space="preserve">Telephony</w:t>
+            </w:r>
+          </w:p>
+        </w:tc>
+        <w:tc>
+          <w:tcPr>
+            <w:tcW w:w="3571" w:type="dxa"/>
+          </w:tcPr>
+          <w:p>
+            <w:pPr>
+              <w:pStyle w:val="Table"/>
+              <w:rPr>
+                <w:lang w:val="en-GB"/>
+              </w:rPr>
+            </w:pPr>
+            <w:r>
+              <w:rPr>
+                <w:lang w:val="en-GB"/>
+              </w:rPr>
+              <w:t xml:space="preserve">Twilio minutes or a SIP trunk (Asterisk)</w:t>
+            </w:r>
+          </w:p>
+        </w:tc>
+        <w:tc>
+          <w:tcPr>
+            <w:tcW w:w="1800" w:type="dxa"/>
+          </w:tcPr>
+          <w:p>
+            <w:pPr>
+              <w:pStyle w:val="Table"/>
+              <w:rPr>
+                <w:lang w:val="en-GB"/>
+              </w:rPr>
+            </w:pPr>
+            <w:r>
+              <w:rPr>
+                <w:highlight w:val="yellow"/>
+                <w:lang w:val="en-GB"/>
+              </w:rPr>
+              <w:t xml:space="preserve">to be filled</w:t>
+            </w:r>
+          </w:p>
+        </w:tc>
+        <w:tc>
+          <w:tcPr>
+            <w:tcW w:w="1800" w:type="dxa"/>
+          </w:tcPr>
+          <w:p>
+            <w:pPr>
+              <w:pStyle w:val="Table"/>
+              <w:rPr>
+                <w:lang w:val="en-GB"/>
+              </w:rPr>
+            </w:pPr>
+            <w:r>
+              <w:rPr>
+                <w:highlight w:val="yellow"/>
+                <w:lang w:val="en-GB"/>
+              </w:rPr>
+              <w:t xml:space="preserve">to be filled</w:t>
+            </w:r>
+          </w:p>
+        </w:tc>
+      </w:tr>
+      <w:tr>
+        <w:tc>
+          <w:tcPr>
+            <w:tcW w:w="1900" w:type="dxa"/>
+          </w:tcPr>
+          <w:p>
+            <w:pPr>
+              <w:pStyle w:val="Table"/>
+              <w:rPr>
+                <w:lang w:val="en-GB"/>
+              </w:rPr>
+            </w:pPr>
+            <w:r>
+              <w:rPr>
+                <w:lang w:val="en-GB"/>
+              </w:rPr>
+              <w:t xml:space="preserve">Total</w:t>
+            </w:r>
+          </w:p>
+        </w:tc>
+        <w:tc>
+          <w:tcPr>
+            <w:tcW w:w="3571" w:type="dxa"/>
+          </w:tcPr>
+          <w:p>
+            <w:pPr>
+              <w:pStyle w:val="Table"/>
+              <w:rPr>
+                <w:lang w:val="en-GB"/>
+              </w:rPr>
+            </w:pPr>
+          </w:p>
+        </w:tc>
+        <w:tc>
+          <w:tcPr>
+            <w:tcW w:w="1800" w:type="dxa"/>
+          </w:tcPr>
+          <w:p>
+            <w:pPr>
+              <w:pStyle w:val="Table"/>
+              <w:rPr>
+                <w:lang w:val="en-GB"/>
+              </w:rPr>
+            </w:pPr>
+            <w:r>
+              <w:rPr>
+                <w:highlight w:val="yellow"/>
+                <w:lang w:val="en-GB"/>
+              </w:rPr>
+              <w:t xml:space="preserve">to be filled</w:t>
+            </w:r>
+          </w:p>
+        </w:tc>
+        <w:tc>
+          <w:tcPr>
+            <w:tcW w:w="1800" w:type="dxa"/>
+          </w:tcPr>
+          <w:p>
+            <w:pPr>
+              <w:pStyle w:val="Table"/>
+              <w:rPr>
+                <w:lang w:val="en-GB"/>
+              </w:rPr>
+            </w:pPr>
+            <w:r>
+              <w:rPr>
+                <w:highlight w:val="yellow"/>
+                <w:lang w:val="en-GB"/>
+              </w:rPr>
+              <w:t xml:space="preserve">to be filled</w:t>
+            </w:r>
+          </w:p>
+        </w:tc>
+      </w:tr>
+    </w:tbl>
+    <w:p>
+      <w:pPr>
+        <w:rPr>
+          <w:lang w:val="en-GB"/>
+        </w:rPr>
+      </w:pPr>
+    </w:p>
+    <w:p>
+      <w:pPr>
+        <w:rPr>
+          <w:lang w:val="en-GB"/>
+        </w:rPr>
+      </w:pPr>
+      <w:r>
+        <w:rPr>
+          <w:b/>
+          <w:bCs/>
+          <w:lang w:val="en-GB"/>
+        </w:rPr>
+        <w:t xml:space="preserve">Cost estimation.</w:t>
+      </w:r>
+      <w:r>
+        <w:rPr>
+          <w:lang w:val="en-GB"/>
+        </w:rPr>
+        <w:t xml:space="preserve"> The story points of each task were converted into hours, and the hours into money with the hourly rate. The cost of a sprint was the sum of its tasks. Running costs (AI and telephony) were estimated as the cost of one call × the expected number of calls.</w:t>
+      </w:r>
+    </w:p>
+    <w:p>
+      <w:pPr>
+        <w:rPr>
+          <w:lang w:val="en-GB"/>
+        </w:rPr>
+      </w:pPr>
+      <w:r>
+        <w:rPr>
+          <w:b/>
+          <w:bCs/>
+          <w:lang w:val="en-GB"/>
+        </w:rPr>
+        <w:t xml:space="preserve">Decisions that reduced costs:</w:t>
+      </w:r>
+    </w:p>
+    <w:p>
+      <w:pPr>
+        <w:pStyle w:val="ListParagraph"/>
+        <w:numPr>
+          <w:ilvl w:val="0"/>
+          <w:numId w:val="20"/>
+        </w:numPr>
+        <w:spacing w:after="60"/>
+        <w:rPr>
+          <w:lang w:val="en-GB"/>
+        </w:rPr>
+      </w:pPr>
+      <w:r>
+        <w:rPr>
+          <w:lang w:val="en-GB"/>
+        </w:rPr>
+        <w:t xml:space="preserve">a free local AI engine: the system works fully without API keys, so tests and demos cost almost nothing;</w:t>
+      </w:r>
+    </w:p>
+    <w:p>
+      <w:pPr>
+        <w:pStyle w:val="ListParagraph"/>
+        <w:numPr>
+          <w:ilvl w:val="0"/>
+          <w:numId w:val="20"/>
+        </w:numPr>
+        <w:spacing w:after="60"/>
+        <w:rPr>
+          <w:lang w:val="en-GB"/>
+        </w:rPr>
+      </w:pPr>
+      <w:r>
+        <w:rPr>
+          <w:lang w:val="en-GB"/>
+        </w:rPr>
+        <w:t xml:space="preserve">automatic fallback: if Claude or Gemini fails, the system returns to the local engine;</w:t>
+      </w:r>
+    </w:p>
+    <w:p>
+      <w:pPr>
+        <w:pStyle w:val="ListParagraph"/>
+        <w:numPr>
+          <w:ilvl w:val="0"/>
+          <w:numId w:val="20"/>
+        </w:numPr>
+        <w:spacing w:after="60"/>
+        <w:rPr>
+          <w:lang w:val="en-GB"/>
+        </w:rPr>
+      </w:pPr>
+      <w:r>
+        <w:rPr>
+          <w:lang w:val="en-GB"/>
+        </w:rPr>
+        <w:t xml:space="preserve">local 384-dimension embeddings: indexing documents needs no paid API;</w:t>
+      </w:r>
+    </w:p>
+    <w:p>
+      <w:pPr>
+        <w:pStyle w:val="ListParagraph"/>
+        <w:numPr>
+          <w:ilvl w:val="0"/>
+          <w:numId w:val="20"/>
+        </w:numPr>
+        <w:spacing w:after="60"/>
+        <w:rPr>
+          <w:lang w:val="en-GB"/>
+        </w:rPr>
+      </w:pPr>
+      <w:r>
+        <w:rPr>
+          <w:lang w:val="en-GB"/>
+        </w:rPr>
+        <w:t xml:space="preserve">fixed phrases (greetings, holding lines) are stored as ready audio on disk and are not synthesised again for every call;</w:t>
+      </w:r>
+    </w:p>
+    <w:p>
+      <w:pPr>
+        <w:pStyle w:val="ListParagraph"/>
+        <w:numPr>
+          <w:ilvl w:val="0"/>
+          <w:numId w:val="20"/>
+        </w:numPr>
+        <w:spacing w:after="60"/>
+        <w:rPr>
+          <w:lang w:val="en-GB"/>
+        </w:rPr>
+      </w:pPr>
+      <w:r>
+        <w:rPr>
+          <w:lang w:val="en-GB"/>
+        </w:rPr>
+        <w:t xml:space="preserve">a built-in call simulator: the team could test without paying for phone minutes.</w:t>
+      </w:r>
+    </w:p>
+    <w:p>
+      <w:pPr>
+        <w:rPr>
+          <w:lang w:val="en-GB"/>
+        </w:rPr>
+      </w:pPr>
+      <w:r>
+        <w:rPr>
+          <w:b/>
+          <w:bCs/>
+          <w:lang w:val="en-GB"/>
+        </w:rPr>
+        <w:t xml:space="preserve">Cost control.</w:t>
+      </w:r>
+      <w:r>
+        <w:rPr>
+          <w:lang w:val="en-GB"/>
+        </w:rPr>
+        <w:t xml:space="preserve"> The system writes daily usage to the usage_daily table and invoices to the invoices table, and billing works in UZS. This is the base for real-time cost tracking. At the end of each sprint I calculated the budget variance (planned − actual) and the CPI (earned value / actual cost).</w:t>
+      </w:r>
+    </w:p>
+    <w:p>
+      <w:pPr>
+        <w:rPr>
+          <w:lang w:val="en-GB"/>
+        </w:rPr>
+      </w:pPr>
+      <w:r>
+        <w:rPr>
+          <w:b/>
+          <w:bCs/>
+          <w:lang w:val="en-GB"/>
+        </w:rPr>
+        <w:t xml:space="preserve">Economic effect for customers.</w:t>
+      </w:r>
+      <w:r>
+        <w:rPr>
+          <w:lang w:val="en-GB"/>
+        </w:rPr>
+        <w:t xml:space="preserve"> The agent answers simple calls itself and only low-confidence calls go to an operator, so a company needs fewer operators for the same number of calls. ROI = (saved operator cost − system cost) / system cost.</w:t>
+      </w:r>
+    </w:p>
+    <w:p>
+      <w:pPr>
+        <w:pStyle w:val="Heading2"/>
+        <w:rPr>
+          <w:lang w:val="en-GB"/>
+        </w:rPr>
+      </w:pPr>
+      <w:r>
+        <w:rPr>
+          <w:lang w:val="en-GB"/>
+        </w:rPr>
+        <w:t xml:space="preserve">3.5. Traditional vs AI-driven financial management</w:t>
+      </w:r>
+    </w:p>
+    <w:p>
+      <w:pPr>
+        <w:rPr>
+          <w:lang w:val="en-GB"/>
+        </w:rPr>
+      </w:pPr>
+      <w:r>
+        <w:rPr>
+          <w:lang w:val="en-GB"/>
+        </w:rPr>
+        <w:t xml:space="preserve">This part connects the internship with my research topic. The table compares the two approaches at each stage of financial management, with examples from CallMindVoice.</w:t>
       </w:r>
     </w:p>
     <w:tbl>
@@ -4741,7 +5449,7 @@
                 <w:bCs/>
                 <w:lang w:val="en-GB"/>
               </w:rPr>
-              <w:t xml:space="preserve">Area</w:t>
+              <w:t xml:space="preserve">Stage</w:t>
             </w:r>
           </w:p>
         </w:tc>
@@ -4828,7 +5536,7 @@
               <w:rPr>
                 <w:lang w:val="en-GB"/>
               </w:rPr>
-              <w:t xml:space="preserve">Scope</w:t>
+              <w:t xml:space="preserve">Cost estimation</w:t>
             </w:r>
           </w:p>
         </w:tc>
@@ -4847,7 +5555,7 @@
               <w:rPr>
                 <w:lang w:val="en-GB"/>
               </w:rPr>
-              <w:t xml:space="preserve">The PM writes requirements by hand; changes are agreed in meetings</w:t>
+              <w:t xml:space="preserve">Expert judgement; hours × rate in Excel</w:t>
             </w:r>
           </w:p>
         </w:tc>
@@ -4866,7 +5574,7 @@
               <w:rPr>
                 <w:lang w:val="en-GB"/>
               </w:rPr>
-              <w:t xml:space="preserve">An agent turns requirement text into tasks and finds duplicate or unclear requirements</w:t>
+              <w:t xml:space="preserve">Cost is predicted from the data of past sprints</w:t>
             </w:r>
           </w:p>
         </w:tc>
@@ -4885,7 +5593,7 @@
               <w:rPr>
                 <w:lang w:val="en-GB"/>
               </w:rPr>
-              <w:t xml:space="preserve">The project brief was written for AI agents; known defects were found by reading the code and moved to the backlog</w:t>
+              <w:t xml:space="preserve">Story points were converted into hours and money; AI assistants sped up estimation</w:t>
             </w:r>
           </w:p>
         </w:tc>
@@ -4906,7 +5614,7 @@
               <w:rPr>
                 <w:lang w:val="en-GB"/>
               </w:rPr>
-              <w:t xml:space="preserve">Schedule</w:t>
+              <w:t xml:space="preserve">Budgeting</w:t>
             </w:r>
           </w:p>
         </w:tc>
@@ -4925,7 +5633,7 @@
               <w:rPr>
                 <w:lang w:val="en-GB"/>
               </w:rPr>
-              <w:t xml:space="preserve">Expert estimates and Gantt charts; delays are seen only at stand-ups</w:t>
+              <w:t xml:space="preserve">The budget is made once at the start</w:t>
             </w:r>
           </w:p>
         </w:tc>
@@ -4944,7 +5652,7 @@
               <w:rPr>
                 <w:lang w:val="en-GB"/>
               </w:rPr>
-              <w:t xml:space="preserve">Delays are predicted from past sprint data and flagged early</w:t>
+              <w:t xml:space="preserve">The budget is updated every sprint from real data</w:t>
             </w:r>
           </w:p>
         </w:tc>
@@ -4963,7 +5671,7 @@
               <w:rPr>
                 <w:lang w:val="en-GB"/>
               </w:rPr>
-              <w:t xml:space="preserve">The 800 ms latency target was an acceptance criterion measured by QA</w:t>
+              <w:t xml:space="preserve">Planned and actual costs were compared at the end of every sprint</w:t>
             </w:r>
           </w:p>
         </w:tc>
@@ -4984,7 +5692,7 @@
               <w:rPr>
                 <w:lang w:val="en-GB"/>
               </w:rPr>
-              <w:t xml:space="preserve">Finance</w:t>
+              <w:t xml:space="preserve">Cost control</w:t>
             </w:r>
           </w:p>
         </w:tc>
@@ -5003,7 +5711,7 @@
               <w:rPr>
                 <w:lang w:val="en-GB"/>
               </w:rPr>
-              <w:t xml:space="preserve">Hours × rate in Excel, monthly reports</w:t>
+              <w:t xml:space="preserve">Monthly reports; problems are found late</w:t>
             </w:r>
           </w:p>
         </w:tc>
@@ -5022,7 +5730,7 @@
               <w:rPr>
                 <w:lang w:val="en-GB"/>
               </w:rPr>
-              <w:t xml:space="preserve">Real-time cost forecast; automatic switch to a cheaper model or local engine</w:t>
+              <w:t xml:space="preserve">Real-time tracking and early warnings about budget risk</w:t>
             </w:r>
           </w:p>
         </w:tc>
@@ -5041,7 +5749,7 @@
               <w:rPr>
                 <w:lang w:val="en-GB"/>
               </w:rPr>
-              <w:t xml:space="preserve">The local engine works without API keys; Claude/Gemini are used only when a key is set</w:t>
+              <w:t xml:space="preserve">The usage_daily and invoices tables record usage every day</w:t>
             </w:r>
           </w:p>
         </w:tc>
@@ -5062,7 +5770,7 @@
               <w:rPr>
                 <w:lang w:val="en-GB"/>
               </w:rPr>
-              <w:t xml:space="preserve">Resources</w:t>
+              <w:t xml:space="preserve">Cost optimisation</w:t>
             </w:r>
           </w:p>
         </w:tc>
@@ -5081,7 +5789,7 @@
               <w:rPr>
                 <w:lang w:val="en-GB"/>
               </w:rPr>
-              <w:t xml:space="preserve">Assignment by the PM's experience; overload is noticed late</w:t>
+              <w:t xml:space="preserve">Manual decision about which service is cheaper</w:t>
             </w:r>
           </w:p>
         </w:tc>
@@ -5100,7 +5808,7 @@
               <w:rPr>
                 <w:lang w:val="en-GB"/>
               </w:rPr>
-              <w:t xml:space="preserve">An agent suggests the best assignee by skills and workload; AI assistants write routine code</w:t>
+              <w:t xml:space="preserve">An agent automatically chooses a cheaper model or the free engine</w:t>
             </w:r>
           </w:p>
         </w:tc>
@@ -5119,7 +5827,163 @@
               <w:rPr>
                 <w:lang w:val="en-GB"/>
               </w:rPr>
-              <w:t xml:space="preserve">One owner per layer; developers worked with AI coding assistants</w:t>
+              <w:t xml:space="preserve">Local engine with fallback; cached audio; local embeddings</w:t>
+            </w:r>
+          </w:p>
+        </w:tc>
+      </w:tr>
+      <w:tr>
+        <w:tc>
+          <w:tcPr>
+            <w:tcW w:w="1500" w:type="dxa"/>
+          </w:tcPr>
+          <w:p>
+            <w:pPr>
+              <w:pStyle w:val="Table"/>
+              <w:rPr>
+                <w:lang w:val="en-GB"/>
+              </w:rPr>
+            </w:pPr>
+            <w:r>
+              <w:rPr>
+                <w:lang w:val="en-GB"/>
+              </w:rPr>
+              <w:t xml:space="preserve">Labour cost</w:t>
+            </w:r>
+          </w:p>
+        </w:tc>
+        <w:tc>
+          <w:tcPr>
+            <w:tcW w:w="2400" w:type="dxa"/>
+          </w:tcPr>
+          <w:p>
+            <w:pPr>
+              <w:pStyle w:val="Table"/>
+              <w:rPr>
+                <w:lang w:val="en-GB"/>
+              </w:rPr>
+            </w:pPr>
+            <w:r>
+              <w:rPr>
+                <w:lang w:val="en-GB"/>
+              </w:rPr>
+              <w:t xml:space="preserve">Work is split by the PM's experience</w:t>
+            </w:r>
+          </w:p>
+        </w:tc>
+        <w:tc>
+          <w:tcPr>
+            <w:tcW w:w="2600" w:type="dxa"/>
+          </w:tcPr>
+          <w:p>
+            <w:pPr>
+              <w:pStyle w:val="Table"/>
+              <w:rPr>
+                <w:lang w:val="en-GB"/>
+              </w:rPr>
+            </w:pPr>
+            <w:r>
+              <w:rPr>
+                <w:lang w:val="en-GB"/>
+              </w:rPr>
+              <w:t xml:space="preserve">AI assistants write routine code and reduce working hours</w:t>
+            </w:r>
+          </w:p>
+        </w:tc>
+        <w:tc>
+          <w:tcPr>
+            <w:tcW w:w="2571" w:type="dxa"/>
+          </w:tcPr>
+          <w:p>
+            <w:pPr>
+              <w:pStyle w:val="Table"/>
+              <w:rPr>
+                <w:lang w:val="en-GB"/>
+              </w:rPr>
+            </w:pPr>
+            <w:r>
+              <w:rPr>
+                <w:lang w:val="en-GB"/>
+              </w:rPr>
+              <w:t xml:space="preserve">Developers worked with AI coding assistants</w:t>
+            </w:r>
+          </w:p>
+        </w:tc>
+      </w:tr>
+      <w:tr>
+        <w:tc>
+          <w:tcPr>
+            <w:tcW w:w="1500" w:type="dxa"/>
+          </w:tcPr>
+          <w:p>
+            <w:pPr>
+              <w:pStyle w:val="Table"/>
+              <w:rPr>
+                <w:lang w:val="en-GB"/>
+              </w:rPr>
+            </w:pPr>
+            <w:r>
+              <w:rPr>
+                <w:lang w:val="en-GB"/>
+              </w:rPr>
+              <w:t xml:space="preserve">Effectiveness (ROI)</w:t>
+            </w:r>
+          </w:p>
+        </w:tc>
+        <w:tc>
+          <w:tcPr>
+            <w:tcW w:w="2400" w:type="dxa"/>
+          </w:tcPr>
+          <w:p>
+            <w:pPr>
+              <w:pStyle w:val="Table"/>
+              <w:rPr>
+                <w:lang w:val="en-GB"/>
+              </w:rPr>
+            </w:pPr>
+            <w:r>
+              <w:rPr>
+                <w:lang w:val="en-GB"/>
+              </w:rPr>
+              <w:t xml:space="preserve">Measured at the end of the project</w:t>
+            </w:r>
+          </w:p>
+        </w:tc>
+        <w:tc>
+          <w:tcPr>
+            <w:tcW w:w="2600" w:type="dxa"/>
+          </w:tcPr>
+          <w:p>
+            <w:pPr>
+              <w:pStyle w:val="Table"/>
+              <w:rPr>
+                <w:lang w:val="en-GB"/>
+              </w:rPr>
+            </w:pPr>
+            <w:r>
+              <w:rPr>
+                <w:lang w:val="en-GB"/>
+              </w:rPr>
+              <w:t xml:space="preserve">Cost per call and savings are calculated all the time</w:t>
+            </w:r>
+          </w:p>
+        </w:tc>
+        <w:tc>
+          <w:tcPr>
+            <w:tcW w:w="2571" w:type="dxa"/>
+          </w:tcPr>
+          <w:p>
+            <w:pPr>
+              <w:pStyle w:val="Table"/>
+              <w:rPr>
+                <w:lang w:val="en-GB"/>
+              </w:rPr>
+            </w:pPr>
+            <w:r>
+              <w:rPr>
+                <w:lang w:val="en-GB"/>
+              </w:rPr>
+              <w:t xml:space="preserve">The agent closes simple calls itself, reducing operator cost</w:t>
             </w:r>
           </w:p>
         </w:tc>
@@ -5142,7 +6006,7 @@
         <w:rPr>
           <w:lang w:val="en-GB"/>
         </w:rPr>
-        <w:t xml:space="preserve">The main finding: AI tools speed up estimation, routine coding, defect finding and monitoring. However, scope boundaries, quality rules and the final decisions stay with people. The product follows the same principle: when the AI is not confident, a human operator takes over.</w:t>
+        <w:t xml:space="preserve">The main finding: AI-driven agents make financial management more effective. They track costs all the time, predict budget risks early and choose cheaper options automatically. However, the budget, the priorities and the final decisions stay with people. The product follows the same principle: when the AI is not confident, a human operator takes over.</w:t>
       </w:r>
     </w:p>
     <w:p>
@@ -5156,7 +6020,7 @@
         <w:rPr>
           <w:lang w:val="en-GB"/>
         </w:rPr>
-        <w:t xml:space="preserve">3.5. Project status and plan for the remaining period</w:t>
+        <w:t xml:space="preserve">3.6. Project status and plan for the remaining period</w:t>
       </w:r>
     </w:p>
     <w:p>
@@ -5232,7 +6096,7 @@
         <w:rPr>
           <w:lang w:val="en-GB"/>
         </w:rPr>
-        <w:t xml:space="preserve">15–18 October: final report, technical documentation and a short user guide;</w:t>
+        <w:t xml:space="preserve">15–18 October: final report with the full financial analysis, and technical documentation;</w:t>
       </w:r>
     </w:p>
     <w:p>
@@ -5467,13 +6331,67 @@
           <w:bCs/>
           <w:lang w:val="en-GB"/>
         </w:rPr>
+        <w:t xml:space="preserve">Cost decisions belong in the architecture.</w:t>
+      </w:r>
+      <w:r>
+        <w:rPr>
+          <w:lang w:val="en-GB"/>
+        </w:rPr>
+        <w:t xml:space="preserve"> The free local engine, fallback and cached audio kept AI and telephony costs low from the first day.</w:t>
+      </w:r>
+    </w:p>
+    <w:p>
+      <w:pPr>
+        <w:pStyle w:val="ListParagraph"/>
+        <w:numPr>
+          <w:ilvl w:val="0"/>
+          <w:numId w:val="20"/>
+        </w:numPr>
+        <w:spacing w:after="60"/>
+        <w:rPr>
+          <w:lang w:val="en-GB"/>
+        </w:rPr>
+      </w:pPr>
+      <w:r>
+        <w:rPr>
+          <w:b/>
+          <w:bCs/>
+          <w:lang w:val="en-GB"/>
+        </w:rPr>
+        <w:t xml:space="preserve">Compare plan and fact every sprint.</w:t>
+      </w:r>
+      <w:r>
+        <w:rPr>
+          <w:lang w:val="en-GB"/>
+        </w:rPr>
+        <w:t xml:space="preserve"> Checking planned vs actual cost each sprint is much safer than a monthly report.</w:t>
+      </w:r>
+    </w:p>
+    <w:p>
+      <w:pPr>
+        <w:pStyle w:val="ListParagraph"/>
+        <w:numPr>
+          <w:ilvl w:val="0"/>
+          <w:numId w:val="20"/>
+        </w:numPr>
+        <w:spacing w:after="60"/>
+        <w:rPr>
+          <w:lang w:val="en-GB"/>
+        </w:rPr>
+      </w:pPr>
+      <w:r>
+        <w:rPr>
+          <w:b/>
+          <w:bCs/>
+          <w:lang w:val="en-GB"/>
+        </w:rPr>
         <w:t xml:space="preserve">AI is a strong helper, not a replacement.</w:t>
       </w:r>
       <w:r>
         <w:rPr>
           <w:lang w:val="en-GB"/>
         </w:rPr>
-        <w:t xml:space="preserve"> AI assistants made coding, documentation and defect finding faster, but planning and decisions stayed with people.</w:t>
+        <w:t xml:space="preserve"> AI agents help to forecast and control costs, but the budget decisions stayed with people.</w:t>
       </w:r>
     </w:p>
     <w:p>
@@ -5809,20 +6727,20 @@
         <w:rPr>
           <w:lang w:val="en-GB"/>
         </w:rPr>
-        <w:t xml:space="preserve">As a project manager I improved my skills in planning, estimation, prioritisation and communication with developers. I learned to write tasks with clear acceptance criteria and to keep the whole team working in one shared process.</w:t>
-      </w:r>
-    </w:p>
-    <w:p>
-      <w:pPr>
-        <w:rPr>
-          <w:lang w:val="en-GB"/>
-        </w:rPr>
-      </w:pPr>
-      <w:r>
-        <w:rPr>
-          <w:lang w:val="en-GB"/>
-        </w:rPr>
-        <w:t xml:space="preserve">I also gained practical experience with AI-driven project management, which is the core of my master's research. I saw where AI tools really save time and where human judgement is still needed. This experience gives me real data and examples for my thesis and prepares me for project management roles in AI product teams.</w:t>
+        <w:t xml:space="preserve">As a project manager I improved my skills in budgeting, cost estimation, cost control, prioritisation and communication with developers. I learned to write tasks with clear acceptance criteria and to keep the whole team working in one shared process.</w:t>
+      </w:r>
+    </w:p>
+    <w:p>
+      <w:pPr>
+        <w:rPr>
+          <w:lang w:val="en-GB"/>
+        </w:rPr>
+      </w:pPr>
+      <w:r>
+        <w:rPr>
+          <w:lang w:val="en-GB"/>
+        </w:rPr>
+        <w:t xml:space="preserve">I also gained practical experience with AI-driven financial management of an IT project, which is the core of my master's research. I saw where AI tools really save time and where human judgement is still needed. This experience gives me real data and examples for my thesis and prepares me for project management roles in AI product teams.</w:t>
       </w:r>
     </w:p>
     <w:p>

</xml_diff>

<commit_message>
Add estimated budget figures and ROI example to speech and report
Co-Authored-By: Claude Opus 5.5 <noreply@anthropic.com>
Claude-Session: https://claude.ai/code/session_01B5ATUDZVupjMwC75REBTzv
</commit_message>
<xml_diff>
--- a/internship/Internship_Report_Muhammadjon.docx
+++ b/internship/Internship_Report_Muhammadjon.docx
@@ -4706,6 +4706,19 @@
         <w:t xml:space="preserve">Financial management was the main focus of my work, because it is the subject of my master's research. The budget was split into four cost groups, and at the end of every sprint the planned cost was compared with the actual cost.</w:t>
       </w:r>
     </w:p>
+    <w:p>
+      <w:pPr>
+        <w:rPr>
+          <w:lang w:val="en-GB"/>
+        </w:rPr>
+      </w:pPr>
+      <w:r>
+        <w:rPr>
+          <w:lang w:val="en-GB"/>
+        </w:rPr>
+        <w:t xml:space="preserve">All figures are estimates at market rates: 7 September – 14 October (about 5.5 weeks), about 20 hours per person per week, 90,000 UZS/hour for developers, 100,000 UZS/hour for the PM, 1 USD ≈ 12,700 UZS.</w:t>
+      </w:r>
+    </w:p>
     <w:tbl>
       <w:tblPr>
         <w:tblStyle w:val="TableGrid"/>
@@ -4714,10 +4727,11 @@
         <w:tblLook w:val="04A0" w:firstRow="1" w:lastRow="0" w:firstColumn="1" w:lastColumn="0" w:noHBand="0" w:noVBand="1"/>
       </w:tblPr>
       <w:tblGrid>
-        <w:gridCol w:w="1900"/>
-        <w:gridCol w:w="3571"/>
-        <w:gridCol w:w="1800"/>
-        <w:gridCol w:w="1800"/>
+        <w:gridCol w:w="1500"/>
+        <w:gridCol w:w="2671"/>
+        <w:gridCol w:w="1600"/>
+        <w:gridCol w:w="1600"/>
+        <w:gridCol w:w="1700"/>
       </w:tblGrid>
       <w:tr>
         <w:trPr>
@@ -4725,7 +4739,7 @@
         </w:trPr>
         <w:tc>
           <w:tcPr>
-            <w:tcW w:w="1900" w:type="dxa"/>
+            <w:tcW w:w="1500" w:type="dxa"/>
             <w:shd w:val="clear" w:color="auto" w:fill="F2F2F2"/>
           </w:tcPr>
           <w:p>
@@ -4747,7 +4761,7 @@
         </w:tc>
         <w:tc>
           <w:tcPr>
-            <w:tcW w:w="3571" w:type="dxa"/>
+            <w:tcW w:w="2671" w:type="dxa"/>
             <w:shd w:val="clear" w:color="auto" w:fill="F2F2F2"/>
           </w:tcPr>
           <w:p>
@@ -4769,7 +4783,7 @@
         </w:tc>
         <w:tc>
           <w:tcPr>
-            <w:tcW w:w="1800" w:type="dxa"/>
+            <w:tcW w:w="1600" w:type="dxa"/>
             <w:shd w:val="clear" w:color="auto" w:fill="F2F2F2"/>
           </w:tcPr>
           <w:p>
@@ -4791,7 +4805,7 @@
         </w:tc>
         <w:tc>
           <w:tcPr>
-            <w:tcW w:w="1800" w:type="dxa"/>
+            <w:tcW w:w="1600" w:type="dxa"/>
             <w:shd w:val="clear" w:color="auto" w:fill="F2F2F2"/>
           </w:tcPr>
           <w:p>
@@ -4811,11 +4825,33 @@
             </w:r>
           </w:p>
         </w:tc>
+        <w:tc>
+          <w:tcPr>
+            <w:tcW w:w="1700" w:type="dxa"/>
+            <w:shd w:val="clear" w:color="auto" w:fill="F2F2F2"/>
+          </w:tcPr>
+          <w:p>
+            <w:pPr>
+              <w:pStyle w:val="Table"/>
+              <w:rPr>
+                <w:lang w:val="en-GB"/>
+              </w:rPr>
+            </w:pPr>
+            <w:r>
+              <w:rPr>
+                <w:b/>
+                <w:bCs/>
+                <w:lang w:val="en-GB"/>
+              </w:rPr>
+              <w:t xml:space="preserve">Variance (UZS)</w:t>
+            </w:r>
+          </w:p>
+        </w:tc>
       </w:tr>
       <w:tr>
         <w:tc>
           <w:tcPr>
-            <w:tcW w:w="1900" w:type="dxa"/>
+            <w:tcW w:w="1500" w:type="dxa"/>
           </w:tcPr>
           <w:p>
             <w:pPr>
@@ -4834,60 +4870,77 @@
         </w:tc>
         <w:tc>
           <w:tcPr>
-            <w:tcW w:w="3571" w:type="dxa"/>
-          </w:tcPr>
-          <w:p>
-            <w:pPr>
-              <w:pStyle w:val="Table"/>
-              <w:rPr>
-                <w:lang w:val="en-GB"/>
-              </w:rPr>
-            </w:pPr>
-            <w:r>
-              <w:rPr>
-                <w:lang w:val="en-GB"/>
-              </w:rPr>
-              <w:t xml:space="preserve">Working hours of 7 people × hourly rate</w:t>
-            </w:r>
-          </w:p>
-        </w:tc>
-        <w:tc>
-          <w:tcPr>
-            <w:tcW w:w="1800" w:type="dxa"/>
-          </w:tcPr>
-          <w:p>
-            <w:pPr>
-              <w:pStyle w:val="Table"/>
-              <w:rPr>
-                <w:lang w:val="en-GB"/>
-              </w:rPr>
-            </w:pPr>
-            <w:r>
-              <w:rPr>
-                <w:highlight w:val="yellow"/>
-                <w:lang w:val="en-GB"/>
-              </w:rPr>
-              <w:t xml:space="preserve">to be filled</w:t>
-            </w:r>
-          </w:p>
-        </w:tc>
-        <w:tc>
-          <w:tcPr>
-            <w:tcW w:w="1800" w:type="dxa"/>
-          </w:tcPr>
-          <w:p>
-            <w:pPr>
-              <w:pStyle w:val="Table"/>
-              <w:rPr>
-                <w:lang w:val="en-GB"/>
-              </w:rPr>
-            </w:pPr>
-            <w:r>
-              <w:rPr>
-                <w:highlight w:val="yellow"/>
-                <w:lang w:val="en-GB"/>
-              </w:rPr>
-              <w:t xml:space="preserve">to be filled</w:t>
+            <w:tcW w:w="2671" w:type="dxa"/>
+          </w:tcPr>
+          <w:p>
+            <w:pPr>
+              <w:pStyle w:val="Table"/>
+              <w:rPr>
+                <w:lang w:val="en-GB"/>
+              </w:rPr>
+            </w:pPr>
+            <w:r>
+              <w:rPr>
+                <w:lang w:val="en-GB"/>
+              </w:rPr>
+              <w:t xml:space="preserve">PM 110→115 h, 6 developers 660→696 h</w:t>
+            </w:r>
+          </w:p>
+        </w:tc>
+        <w:tc>
+          <w:tcPr>
+            <w:tcW w:w="1600" w:type="dxa"/>
+          </w:tcPr>
+          <w:p>
+            <w:pPr>
+              <w:pStyle w:val="Table"/>
+              <w:rPr>
+                <w:lang w:val="en-GB"/>
+              </w:rPr>
+            </w:pPr>
+            <w:r>
+              <w:rPr>
+                <w:lang w:val="en-GB"/>
+              </w:rPr>
+              <w:t xml:space="preserve">70,400,000</w:t>
+            </w:r>
+          </w:p>
+        </w:tc>
+        <w:tc>
+          <w:tcPr>
+            <w:tcW w:w="1600" w:type="dxa"/>
+          </w:tcPr>
+          <w:p>
+            <w:pPr>
+              <w:pStyle w:val="Table"/>
+              <w:rPr>
+                <w:lang w:val="en-GB"/>
+              </w:rPr>
+            </w:pPr>
+            <w:r>
+              <w:rPr>
+                <w:lang w:val="en-GB"/>
+              </w:rPr>
+              <w:t xml:space="preserve">74,140,000</w:t>
+            </w:r>
+          </w:p>
+        </w:tc>
+        <w:tc>
+          <w:tcPr>
+            <w:tcW w:w="1700" w:type="dxa"/>
+          </w:tcPr>
+          <w:p>
+            <w:pPr>
+              <w:pStyle w:val="Table"/>
+              <w:rPr>
+                <w:lang w:val="en-GB"/>
+              </w:rPr>
+            </w:pPr>
+            <w:r>
+              <w:rPr>
+                <w:lang w:val="en-GB"/>
+              </w:rPr>
+              <w:t xml:space="preserve">−3,740,000 (+5.3%)</w:t>
             </w:r>
           </w:p>
         </w:tc>
@@ -4895,7 +4948,7 @@
       <w:tr>
         <w:tc>
           <w:tcPr>
-            <w:tcW w:w="1900" w:type="dxa"/>
+            <w:tcW w:w="1500" w:type="dxa"/>
           </w:tcPr>
           <w:p>
             <w:pPr>
@@ -4914,60 +4967,77 @@
         </w:tc>
         <w:tc>
           <w:tcPr>
-            <w:tcW w:w="3571" w:type="dxa"/>
-          </w:tcPr>
-          <w:p>
-            <w:pPr>
-              <w:pStyle w:val="Table"/>
-              <w:rPr>
-                <w:lang w:val="en-GB"/>
-              </w:rPr>
-            </w:pPr>
-            <w:r>
-              <w:rPr>
-                <w:lang w:val="en-GB"/>
-              </w:rPr>
-              <w:t xml:space="preserve">Node.js server, nginx/Caddy, HTTPS, backups</w:t>
-            </w:r>
-          </w:p>
-        </w:tc>
-        <w:tc>
-          <w:tcPr>
-            <w:tcW w:w="1800" w:type="dxa"/>
-          </w:tcPr>
-          <w:p>
-            <w:pPr>
-              <w:pStyle w:val="Table"/>
-              <w:rPr>
-                <w:lang w:val="en-GB"/>
-              </w:rPr>
-            </w:pPr>
-            <w:r>
-              <w:rPr>
-                <w:highlight w:val="yellow"/>
-                <w:lang w:val="en-GB"/>
-              </w:rPr>
-              <w:t xml:space="preserve">to be filled</w:t>
-            </w:r>
-          </w:p>
-        </w:tc>
-        <w:tc>
-          <w:tcPr>
-            <w:tcW w:w="1800" w:type="dxa"/>
-          </w:tcPr>
-          <w:p>
-            <w:pPr>
-              <w:pStyle w:val="Table"/>
-              <w:rPr>
-                <w:lang w:val="en-GB"/>
-              </w:rPr>
-            </w:pPr>
-            <w:r>
-              <w:rPr>
-                <w:highlight w:val="yellow"/>
-                <w:lang w:val="en-GB"/>
-              </w:rPr>
-              <w:t xml:space="preserve">to be filled</w:t>
+            <w:tcW w:w="2671" w:type="dxa"/>
+          </w:tcPr>
+          <w:p>
+            <w:pPr>
+              <w:pStyle w:val="Table"/>
+              <w:rPr>
+                <w:lang w:val="en-GB"/>
+              </w:rPr>
+            </w:pPr>
+            <w:r>
+              <w:rPr>
+                <w:lang w:val="en-GB"/>
+              </w:rPr>
+              <w:t xml:space="preserve">VPS (~$60), nginx/Caddy, HTTPS, backups</w:t>
+            </w:r>
+          </w:p>
+        </w:tc>
+        <w:tc>
+          <w:tcPr>
+            <w:tcW w:w="1600" w:type="dxa"/>
+          </w:tcPr>
+          <w:p>
+            <w:pPr>
+              <w:pStyle w:val="Table"/>
+              <w:rPr>
+                <w:lang w:val="en-GB"/>
+              </w:rPr>
+            </w:pPr>
+            <w:r>
+              <w:rPr>
+                <w:lang w:val="en-GB"/>
+              </w:rPr>
+              <w:t xml:space="preserve">800,000</w:t>
+            </w:r>
+          </w:p>
+        </w:tc>
+        <w:tc>
+          <w:tcPr>
+            <w:tcW w:w="1600" w:type="dxa"/>
+          </w:tcPr>
+          <w:p>
+            <w:pPr>
+              <w:pStyle w:val="Table"/>
+              <w:rPr>
+                <w:lang w:val="en-GB"/>
+              </w:rPr>
+            </w:pPr>
+            <w:r>
+              <w:rPr>
+                <w:lang w:val="en-GB"/>
+              </w:rPr>
+              <w:t xml:space="preserve">760,000</w:t>
+            </w:r>
+          </w:p>
+        </w:tc>
+        <w:tc>
+          <w:tcPr>
+            <w:tcW w:w="1700" w:type="dxa"/>
+          </w:tcPr>
+          <w:p>
+            <w:pPr>
+              <w:pStyle w:val="Table"/>
+              <w:rPr>
+                <w:lang w:val="en-GB"/>
+              </w:rPr>
+            </w:pPr>
+            <w:r>
+              <w:rPr>
+                <w:lang w:val="en-GB"/>
+              </w:rPr>
+              <w:t xml:space="preserve">+40,000</w:t>
             </w:r>
           </w:p>
         </w:tc>
@@ -4975,7 +5045,7 @@
       <w:tr>
         <w:tc>
           <w:tcPr>
-            <w:tcW w:w="1900" w:type="dxa"/>
+            <w:tcW w:w="1500" w:type="dxa"/>
           </w:tcPr>
           <w:p>
             <w:pPr>
@@ -4994,60 +5064,77 @@
         </w:tc>
         <w:tc>
           <w:tcPr>
-            <w:tcW w:w="3571" w:type="dxa"/>
-          </w:tcPr>
-          <w:p>
-            <w:pPr>
-              <w:pStyle w:val="Table"/>
-              <w:rPr>
-                <w:lang w:val="en-GB"/>
-              </w:rPr>
-            </w:pPr>
-            <w:r>
-              <w:rPr>
-                <w:lang w:val="en-GB"/>
-              </w:rPr>
-              <w:t xml:space="preserve">Claude or Gemini, optional OpenAI embeddings, STT/TTS service</w:t>
-            </w:r>
-          </w:p>
-        </w:tc>
-        <w:tc>
-          <w:tcPr>
-            <w:tcW w:w="1800" w:type="dxa"/>
-          </w:tcPr>
-          <w:p>
-            <w:pPr>
-              <w:pStyle w:val="Table"/>
-              <w:rPr>
-                <w:lang w:val="en-GB"/>
-              </w:rPr>
-            </w:pPr>
-            <w:r>
-              <w:rPr>
-                <w:highlight w:val="yellow"/>
-                <w:lang w:val="en-GB"/>
-              </w:rPr>
-              <w:t xml:space="preserve">to be filled</w:t>
-            </w:r>
-          </w:p>
-        </w:tc>
-        <w:tc>
-          <w:tcPr>
-            <w:tcW w:w="1800" w:type="dxa"/>
-          </w:tcPr>
-          <w:p>
-            <w:pPr>
-              <w:pStyle w:val="Table"/>
-              <w:rPr>
-                <w:lang w:val="en-GB"/>
-              </w:rPr>
-            </w:pPr>
-            <w:r>
-              <w:rPr>
-                <w:highlight w:val="yellow"/>
-                <w:lang w:val="en-GB"/>
-              </w:rPr>
-              <w:t xml:space="preserve">to be filled</w:t>
+            <w:tcW w:w="2671" w:type="dxa"/>
+          </w:tcPr>
+          <w:p>
+            <w:pPr>
+              <w:pStyle w:val="Table"/>
+              <w:rPr>
+                <w:lang w:val="en-GB"/>
+              </w:rPr>
+            </w:pPr>
+            <w:r>
+              <w:rPr>
+                <w:lang w:val="en-GB"/>
+              </w:rPr>
+              <w:t xml:space="preserve">Claude/Gemini test usage</w:t>
+            </w:r>
+          </w:p>
+        </w:tc>
+        <w:tc>
+          <w:tcPr>
+            <w:tcW w:w="1600" w:type="dxa"/>
+          </w:tcPr>
+          <w:p>
+            <w:pPr>
+              <w:pStyle w:val="Table"/>
+              <w:rPr>
+                <w:lang w:val="en-GB"/>
+              </w:rPr>
+            </w:pPr>
+            <w:r>
+              <w:rPr>
+                <w:lang w:val="en-GB"/>
+              </w:rPr>
+              <w:t xml:space="preserve">1,900,000</w:t>
+            </w:r>
+          </w:p>
+        </w:tc>
+        <w:tc>
+          <w:tcPr>
+            <w:tcW w:w="1600" w:type="dxa"/>
+          </w:tcPr>
+          <w:p>
+            <w:pPr>
+              <w:pStyle w:val="Table"/>
+              <w:rPr>
+                <w:lang w:val="en-GB"/>
+              </w:rPr>
+            </w:pPr>
+            <w:r>
+              <w:rPr>
+                <w:lang w:val="en-GB"/>
+              </w:rPr>
+              <w:t xml:space="preserve">760,000</w:t>
+            </w:r>
+          </w:p>
+        </w:tc>
+        <w:tc>
+          <w:tcPr>
+            <w:tcW w:w="1700" w:type="dxa"/>
+          </w:tcPr>
+          <w:p>
+            <w:pPr>
+              <w:pStyle w:val="Table"/>
+              <w:rPr>
+                <w:lang w:val="en-GB"/>
+              </w:rPr>
+            </w:pPr>
+            <w:r>
+              <w:rPr>
+                <w:lang w:val="en-GB"/>
+              </w:rPr>
+              <w:t xml:space="preserve">+1,140,000</w:t>
             </w:r>
           </w:p>
         </w:tc>
@@ -5055,7 +5142,7 @@
       <w:tr>
         <w:tc>
           <w:tcPr>
-            <w:tcW w:w="1900" w:type="dxa"/>
+            <w:tcW w:w="1500" w:type="dxa"/>
           </w:tcPr>
           <w:p>
             <w:pPr>
@@ -5074,60 +5161,77 @@
         </w:tc>
         <w:tc>
           <w:tcPr>
-            <w:tcW w:w="3571" w:type="dxa"/>
-          </w:tcPr>
-          <w:p>
-            <w:pPr>
-              <w:pStyle w:val="Table"/>
-              <w:rPr>
-                <w:lang w:val="en-GB"/>
-              </w:rPr>
-            </w:pPr>
-            <w:r>
-              <w:rPr>
-                <w:lang w:val="en-GB"/>
-              </w:rPr>
-              <w:t xml:space="preserve">Twilio minutes or a SIP trunk (Asterisk)</w:t>
-            </w:r>
-          </w:p>
-        </w:tc>
-        <w:tc>
-          <w:tcPr>
-            <w:tcW w:w="1800" w:type="dxa"/>
-          </w:tcPr>
-          <w:p>
-            <w:pPr>
-              <w:pStyle w:val="Table"/>
-              <w:rPr>
-                <w:lang w:val="en-GB"/>
-              </w:rPr>
-            </w:pPr>
-            <w:r>
-              <w:rPr>
-                <w:highlight w:val="yellow"/>
-                <w:lang w:val="en-GB"/>
-              </w:rPr>
-              <w:t xml:space="preserve">to be filled</w:t>
-            </w:r>
-          </w:p>
-        </w:tc>
-        <w:tc>
-          <w:tcPr>
-            <w:tcW w:w="1800" w:type="dxa"/>
-          </w:tcPr>
-          <w:p>
-            <w:pPr>
-              <w:pStyle w:val="Table"/>
-              <w:rPr>
-                <w:lang w:val="en-GB"/>
-              </w:rPr>
-            </w:pPr>
-            <w:r>
-              <w:rPr>
-                <w:highlight w:val="yellow"/>
-                <w:lang w:val="en-GB"/>
-              </w:rPr>
-              <w:t xml:space="preserve">to be filled</w:t>
+            <w:tcW w:w="2671" w:type="dxa"/>
+          </w:tcPr>
+          <w:p>
+            <w:pPr>
+              <w:pStyle w:val="Table"/>
+              <w:rPr>
+                <w:lang w:val="en-GB"/>
+              </w:rPr>
+            </w:pPr>
+            <w:r>
+              <w:rPr>
+                <w:lang w:val="en-GB"/>
+              </w:rPr>
+              <w:t xml:space="preserve">Twilio test minutes</w:t>
+            </w:r>
+          </w:p>
+        </w:tc>
+        <w:tc>
+          <w:tcPr>
+            <w:tcW w:w="1600" w:type="dxa"/>
+          </w:tcPr>
+          <w:p>
+            <w:pPr>
+              <w:pStyle w:val="Table"/>
+              <w:rPr>
+                <w:lang w:val="en-GB"/>
+              </w:rPr>
+            </w:pPr>
+            <w:r>
+              <w:rPr>
+                <w:lang w:val="en-GB"/>
+              </w:rPr>
+              <w:t xml:space="preserve">1,016,000</w:t>
+            </w:r>
+          </w:p>
+        </w:tc>
+        <w:tc>
+          <w:tcPr>
+            <w:tcW w:w="1600" w:type="dxa"/>
+          </w:tcPr>
+          <w:p>
+            <w:pPr>
+              <w:pStyle w:val="Table"/>
+              <w:rPr>
+                <w:lang w:val="en-GB"/>
+              </w:rPr>
+            </w:pPr>
+            <w:r>
+              <w:rPr>
+                <w:lang w:val="en-GB"/>
+              </w:rPr>
+              <w:t xml:space="preserve">320,000</w:t>
+            </w:r>
+          </w:p>
+        </w:tc>
+        <w:tc>
+          <w:tcPr>
+            <w:tcW w:w="1700" w:type="dxa"/>
+          </w:tcPr>
+          <w:p>
+            <w:pPr>
+              <w:pStyle w:val="Table"/>
+              <w:rPr>
+                <w:lang w:val="en-GB"/>
+              </w:rPr>
+            </w:pPr>
+            <w:r>
+              <w:rPr>
+                <w:lang w:val="en-GB"/>
+              </w:rPr>
+              <w:t xml:space="preserve">+696,000</w:t>
             </w:r>
           </w:p>
         </w:tc>
@@ -5135,7 +5239,7 @@
       <w:tr>
         <w:tc>
           <w:tcPr>
-            <w:tcW w:w="1900" w:type="dxa"/>
+            <w:tcW w:w="1500" w:type="dxa"/>
           </w:tcPr>
           <w:p>
             <w:pPr>
@@ -5154,54 +5258,71 @@
         </w:tc>
         <w:tc>
           <w:tcPr>
-            <w:tcW w:w="3571" w:type="dxa"/>
-          </w:tcPr>
-          <w:p>
-            <w:pPr>
-              <w:pStyle w:val="Table"/>
-              <w:rPr>
-                <w:lang w:val="en-GB"/>
-              </w:rPr>
-            </w:pPr>
-          </w:p>
-        </w:tc>
-        <w:tc>
-          <w:tcPr>
-            <w:tcW w:w="1800" w:type="dxa"/>
-          </w:tcPr>
-          <w:p>
-            <w:pPr>
-              <w:pStyle w:val="Table"/>
-              <w:rPr>
-                <w:lang w:val="en-GB"/>
-              </w:rPr>
-            </w:pPr>
-            <w:r>
-              <w:rPr>
-                <w:highlight w:val="yellow"/>
-                <w:lang w:val="en-GB"/>
-              </w:rPr>
-              <w:t xml:space="preserve">to be filled</w:t>
-            </w:r>
-          </w:p>
-        </w:tc>
-        <w:tc>
-          <w:tcPr>
-            <w:tcW w:w="1800" w:type="dxa"/>
-          </w:tcPr>
-          <w:p>
-            <w:pPr>
-              <w:pStyle w:val="Table"/>
-              <w:rPr>
-                <w:lang w:val="en-GB"/>
-              </w:rPr>
-            </w:pPr>
-            <w:r>
-              <w:rPr>
-                <w:highlight w:val="yellow"/>
-                <w:lang w:val="en-GB"/>
-              </w:rPr>
-              <w:t xml:space="preserve">to be filled</w:t>
+            <w:tcW w:w="2671" w:type="dxa"/>
+          </w:tcPr>
+          <w:p>
+            <w:pPr>
+              <w:pStyle w:val="Table"/>
+              <w:rPr>
+                <w:lang w:val="en-GB"/>
+              </w:rPr>
+            </w:pPr>
+          </w:p>
+        </w:tc>
+        <w:tc>
+          <w:tcPr>
+            <w:tcW w:w="1600" w:type="dxa"/>
+          </w:tcPr>
+          <w:p>
+            <w:pPr>
+              <w:pStyle w:val="Table"/>
+              <w:rPr>
+                <w:lang w:val="en-GB"/>
+              </w:rPr>
+            </w:pPr>
+            <w:r>
+              <w:rPr>
+                <w:lang w:val="en-GB"/>
+              </w:rPr>
+              <w:t xml:space="preserve">74,116,000</w:t>
+            </w:r>
+          </w:p>
+        </w:tc>
+        <w:tc>
+          <w:tcPr>
+            <w:tcW w:w="1600" w:type="dxa"/>
+          </w:tcPr>
+          <w:p>
+            <w:pPr>
+              <w:pStyle w:val="Table"/>
+              <w:rPr>
+                <w:lang w:val="en-GB"/>
+              </w:rPr>
+            </w:pPr>
+            <w:r>
+              <w:rPr>
+                <w:lang w:val="en-GB"/>
+              </w:rPr>
+              <w:t xml:space="preserve">75,980,000</w:t>
+            </w:r>
+          </w:p>
+        </w:tc>
+        <w:tc>
+          <w:tcPr>
+            <w:tcW w:w="1700" w:type="dxa"/>
+          </w:tcPr>
+          <w:p>
+            <w:pPr>
+              <w:pStyle w:val="Table"/>
+              <w:rPr>
+                <w:lang w:val="en-GB"/>
+              </w:rPr>
+            </w:pPr>
+            <w:r>
+              <w:rPr>
+                <w:lang w:val="en-GB"/>
+              </w:rPr>
+              <w:t xml:space="preserve">−1,864,000 (−2.5%)</w:t>
             </w:r>
           </w:p>
         </w:tc>
@@ -5226,28 +5347,7 @@
           <w:bCs/>
           <w:lang w:val="en-GB"/>
         </w:rPr>
-        <w:t xml:space="preserve">Cost estimation.</w:t>
-      </w:r>
-      <w:r>
-        <w:rPr>
-          <w:lang w:val="en-GB"/>
-        </w:rPr>
-        <w:t xml:space="preserve"> The story points of each task were converted into hours, and the hours into money with the hourly rate. The cost of a sprint was the sum of its tasks. Running costs (AI and telephony) were estimated as the cost of one call × the expected number of calls.</w:t>
-      </w:r>
-    </w:p>
-    <w:p>
-      <w:pPr>
-        <w:rPr>
-          <w:lang w:val="en-GB"/>
-        </w:rPr>
-      </w:pPr>
-      <w:r>
-        <w:rPr>
-          <w:b/>
-          <w:bCs/>
-          <w:lang w:val="en-GB"/>
-        </w:rPr>
-        <w:t xml:space="preserve">Decisions that reduced costs:</w:t>
+        <w:t xml:space="preserve">Key indicators:</w:t>
       </w:r>
     </w:p>
     <w:p>
@@ -5264,9 +5364,17 @@
       </w:pPr>
       <w:r>
         <w:rPr>
-          <w:lang w:val="en-GB"/>
-        </w:rPr>
-        <w:t xml:space="preserve">a free local AI engine: the system works fully without API keys, so tests and demos cost almost nothing;</w:t>
+          <w:b/>
+          <w:bCs/>
+          <w:lang w:val="en-GB"/>
+        </w:rPr>
+        <w:t xml:space="preserve">Budget variance:</w:t>
+      </w:r>
+      <w:r>
+        <w:rPr>
+          <w:lang w:val="en-GB"/>
+        </w:rPr>
+        <w:t xml:space="preserve"> −2.5%. The team cost was 5.3% over plan because the voice latency work in Sprint 3 took more hours;</w:t>
       </w:r>
     </w:p>
     <w:p>
@@ -5283,9 +5391,17 @@
       </w:pPr>
       <w:r>
         <w:rPr>
-          <w:lang w:val="en-GB"/>
-        </w:rPr>
-        <w:t xml:space="preserve">automatic fallback: if Claude or Gemini fails, the system returns to the local engine;</w:t>
+          <w:b/>
+          <w:bCs/>
+          <w:lang w:val="en-GB"/>
+        </w:rPr>
+        <w:t xml:space="preserve">Savings:</w:t>
+      </w:r>
+      <w:r>
+        <w:rPr>
+          <w:lang w:val="en-GB"/>
+        </w:rPr>
+        <w:t xml:space="preserve"> AI and telephony costs were about 1.9 million UZS below plan thanks to the free local engine and the call simulator;</w:t>
       </w:r>
     </w:p>
     <w:p>
@@ -5302,9 +5418,17 @@
       </w:pPr>
       <w:r>
         <w:rPr>
-          <w:lang w:val="en-GB"/>
-        </w:rPr>
-        <w:t xml:space="preserve">local 384-dimension embeddings: indexing documents needs no paid API;</w:t>
+          <w:b/>
+          <w:bCs/>
+          <w:lang w:val="en-GB"/>
+        </w:rPr>
+        <w:t xml:space="preserve">CPI ≈ 0.93:</w:t>
+      </w:r>
+      <w:r>
+        <w:rPr>
+          <w:lang w:val="en-GB"/>
+        </w:rPr>
+        <w:t xml:space="preserve"> about 95% of the planned scope was delivered (EV = 70.4 million UZS, AC = 76.0 million UZS);</w:t>
       </w:r>
     </w:p>
     <w:p>
@@ -5321,9 +5445,53 @@
       </w:pPr>
       <w:r>
         <w:rPr>
-          <w:lang w:val="en-GB"/>
-        </w:rPr>
-        <w:t xml:space="preserve">fixed phrases (greetings, holding lines) are stored as ready audio on disk and are not synthesised again for every call;</w:t>
+          <w:b/>
+          <w:bCs/>
+          <w:lang w:val="en-GB"/>
+        </w:rPr>
+        <w:t xml:space="preserve">Effect of AI assistants:</w:t>
+      </w:r>
+      <w:r>
+        <w:rPr>
+          <w:lang w:val="en-GB"/>
+        </w:rPr>
+        <w:t xml:space="preserve"> without them developers would need about 20% more time (~139 hours), so about 12.5 million UZS was saved.</w:t>
+      </w:r>
+    </w:p>
+    <w:p>
+      <w:pPr>
+        <w:rPr>
+          <w:lang w:val="en-GB"/>
+        </w:rPr>
+      </w:pPr>
+      <w:r>
+        <w:rPr>
+          <w:b/>
+          <w:bCs/>
+          <w:lang w:val="en-GB"/>
+        </w:rPr>
+        <w:t xml:space="preserve">Cost estimation.</w:t>
+      </w:r>
+      <w:r>
+        <w:rPr>
+          <w:lang w:val="en-GB"/>
+        </w:rPr>
+        <w:t xml:space="preserve"> The story points of each task were converted into hours, and the hours into money with the hourly rate. The cost of a sprint was the sum of its tasks. Running costs (AI and telephony) were estimated as the cost of one call × the expected number of calls.</w:t>
+      </w:r>
+    </w:p>
+    <w:p>
+      <w:pPr>
+        <w:rPr>
+          <w:lang w:val="en-GB"/>
+        </w:rPr>
+      </w:pPr>
+      <w:r>
+        <w:rPr>
+          <w:b/>
+          <w:bCs/>
+          <w:lang w:val="en-GB"/>
+        </w:rPr>
+        <w:t xml:space="preserve">Decisions that reduced costs:</w:t>
       </w:r>
     </w:p>
     <w:p>
@@ -5342,6 +5510,82 @@
         <w:rPr>
           <w:lang w:val="en-GB"/>
         </w:rPr>
+        <w:t xml:space="preserve">a free local AI engine: the system works fully without API keys, so tests and demos cost almost nothing;</w:t>
+      </w:r>
+    </w:p>
+    <w:p>
+      <w:pPr>
+        <w:pStyle w:val="ListParagraph"/>
+        <w:numPr>
+          <w:ilvl w:val="0"/>
+          <w:numId w:val="20"/>
+        </w:numPr>
+        <w:spacing w:after="60"/>
+        <w:rPr>
+          <w:lang w:val="en-GB"/>
+        </w:rPr>
+      </w:pPr>
+      <w:r>
+        <w:rPr>
+          <w:lang w:val="en-GB"/>
+        </w:rPr>
+        <w:t xml:space="preserve">automatic fallback: if Claude or Gemini fails, the system returns to the local engine;</w:t>
+      </w:r>
+    </w:p>
+    <w:p>
+      <w:pPr>
+        <w:pStyle w:val="ListParagraph"/>
+        <w:numPr>
+          <w:ilvl w:val="0"/>
+          <w:numId w:val="20"/>
+        </w:numPr>
+        <w:spacing w:after="60"/>
+        <w:rPr>
+          <w:lang w:val="en-GB"/>
+        </w:rPr>
+      </w:pPr>
+      <w:r>
+        <w:rPr>
+          <w:lang w:val="en-GB"/>
+        </w:rPr>
+        <w:t xml:space="preserve">local 384-dimension embeddings: indexing documents needs no paid API;</w:t>
+      </w:r>
+    </w:p>
+    <w:p>
+      <w:pPr>
+        <w:pStyle w:val="ListParagraph"/>
+        <w:numPr>
+          <w:ilvl w:val="0"/>
+          <w:numId w:val="20"/>
+        </w:numPr>
+        <w:spacing w:after="60"/>
+        <w:rPr>
+          <w:lang w:val="en-GB"/>
+        </w:rPr>
+      </w:pPr>
+      <w:r>
+        <w:rPr>
+          <w:lang w:val="en-GB"/>
+        </w:rPr>
+        <w:t xml:space="preserve">fixed phrases (greetings, holding lines) are stored as ready audio on disk and are not synthesised again for every call;</w:t>
+      </w:r>
+    </w:p>
+    <w:p>
+      <w:pPr>
+        <w:pStyle w:val="ListParagraph"/>
+        <w:numPr>
+          <w:ilvl w:val="0"/>
+          <w:numId w:val="20"/>
+        </w:numPr>
+        <w:spacing w:after="60"/>
+        <w:rPr>
+          <w:lang w:val="en-GB"/>
+        </w:rPr>
+      </w:pPr>
+      <w:r>
+        <w:rPr>
+          <w:lang w:val="en-GB"/>
+        </w:rPr>
         <w:t xml:space="preserve">a built-in call simulator: the team could test without paying for phone minutes.</w:t>
       </w:r>
     </w:p>
@@ -5384,7 +5628,7 @@
         <w:rPr>
           <w:lang w:val="en-GB"/>
         </w:rPr>
-        <w:t xml:space="preserve"> The agent answers simple calls itself and only low-confidence calls go to an operator, so a company needs fewer operators for the same number of calls. ROI = (saved operator cost − system cost) / system cost.</w:t>
+        <w:t xml:space="preserve"> The agent answers simple calls itself and only low-confidence calls go to an operator, so a company needs fewer operators for the same number of calls. ROI = (saved operator cost − system cost) / system cost. Example: a clinic has 3 operators earning 6 million UZS a month each. If the agent closes about 60% of calls, one operator fewer is needed, saving 6 million UZS a month. With a subscription of 2.5 million UZS a month, ROI = (6 − 2.5) / 2.5 = 1.4, or 140%: every 1 UZS spent comes back plus 1.4 UZS of profit.</w:t>
       </w:r>
     </w:p>
     <w:p>

</xml_diff>

<commit_message>
Move MVP date to 16 October in speech and report
Co-Authored-By: Claude Opus 5.5 <noreply@anthropic.com>
Claude-Session: https://claude.ai/code/session_01B5ATUDZVupjMwC75REBTzv
</commit_message>
<xml_diff>
--- a/internship/Internship_Report_Muhammadjon.docx
+++ b/internship/Internship_Report_Muhammadjon.docx
@@ -2088,7 +2088,7 @@
           <w:bCs/>
           <w:lang w:val="en-GB"/>
         </w:rPr>
-        <w:t xml:space="preserve">14 October 2026</w:t>
+        <w:t xml:space="preserve">16 October 2026</w:t>
       </w:r>
       <w:r>
         <w:rPr>
@@ -3146,7 +3146,7 @@
               <w:rPr>
                 <w:lang w:val="en-GB"/>
               </w:rPr>
-              <w:t xml:space="preserve">Released the MVP on 14 October 2026</w:t>
+              <w:t xml:space="preserve">Released the MVP on 16 October 2026</w:t>
             </w:r>
           </w:p>
           <w:p>
@@ -4011,7 +4011,7 @@
         <w:rPr>
           <w:lang w:val="en-GB"/>
         </w:rPr>
-        <w:t xml:space="preserve"> planning short sprints from 7 September to the MVP release on 14 October, and tracking progress with a burndown chart and velocity;</w:t>
+        <w:t xml:space="preserve"> planning short sprints from 7 September to the MVP release on 16 October, and tracking progress with a burndown chart and velocity;</w:t>
       </w:r>
     </w:p>
     <w:p>
@@ -4716,7 +4716,7 @@
         <w:rPr>
           <w:lang w:val="en-GB"/>
         </w:rPr>
-        <w:t xml:space="preserve">All figures are estimates at market rates: 7 September – 14 October (about 5.5 weeks), about 20 hours per person per week, 90,000 UZS/hour for developers, 100,000 UZS/hour for the PM, 1 USD ≈ 12,700 UZS.</w:t>
+        <w:t xml:space="preserve">All figures are estimates at market rates: 7 September – 16 October (about 5.5 weeks), about 20 hours per person per week, 90,000 UZS/hour for developers, 100,000 UZS/hour for the PM, 1 USD ≈ 12,700 UZS.</w:t>
       </w:r>
     </w:p>
     <w:tbl>
@@ -6279,7 +6279,7 @@
           <w:bCs/>
           <w:lang w:val="en-GB"/>
         </w:rPr>
-        <w:t xml:space="preserve">Status on 14 October 2026:</w:t>
+        <w:t xml:space="preserve">Status on 16 October 2026:</w:t>
       </w:r>
       <w:r>
         <w:rPr>
@@ -6321,7 +6321,7 @@
           <w:bCs/>
           <w:lang w:val="en-GB"/>
         </w:rPr>
-        <w:t xml:space="preserve">Plan for 15–23 October:</w:t>
+        <w:t xml:space="preserve">Plan for 17–23 October:</w:t>
       </w:r>
     </w:p>
     <w:p>
@@ -6340,7 +6340,7 @@
         <w:rPr>
           <w:lang w:val="en-GB"/>
         </w:rPr>
-        <w:t xml:space="preserve">15–18 October: final report with the full financial analysis, and technical documentation;</w:t>
+        <w:t xml:space="preserve">17–18 October: final report with the full financial analysis, and technical documentation;</w:t>
       </w:r>
     </w:p>
     <w:p>
@@ -6459,7 +6459,7 @@
         <w:rPr>
           <w:lang w:val="en-GB"/>
         </w:rPr>
-        <w:t xml:space="preserve">The internship showed me how a project manager turns a complex AI idea into a working product in a short time. The team delivered the CallMindVoice MVP on schedule, on 14 October 2026, with seven people organised around four system layers.</w:t>
+        <w:t xml:space="preserve">The internship showed me how a project manager turns a complex AI idea into a working product in a short time. The team delivered the CallMindVoice MVP on schedule, on 16 October 2026, with seven people organised around four system layers.</w:t>
       </w:r>
     </w:p>
     <w:p>
@@ -7075,7 +7075,7 @@
         <w:rPr>
           <w:lang w:val="en-GB"/>
         </w:rPr>
-        <w:t xml:space="preserve">Progress video with the project status and the plan for the remaining period (submitted on 14 October 2026);</w:t>
+        <w:t xml:space="preserve">Progress video with the project status and the plan for the remaining period (October 2026);</w:t>
       </w:r>
     </w:p>
     <w:p>

</xml_diff>